<commit_message>
Runbook: replace the tamper step with tamper.bat
The dry run proved the old instruction wrong. It said to corrupt the
newest .enc file in backend\uploads, but the newest file belongs to
whichever document was uploaded last - during the demo that is the
protected case, not the document on screen. Following it corrupts the
wrong document, Verify still reports AUTHENTIC, and the demo fails at
the exact moment it is meant to land.

The step is now: double-click tamper.bat. It picks the file by document
and prints which case and document it hit. The old manual method is
kept only as a warning explaining why not to use it.

Co-Authored-By: Claude Opus 5 <noreply@anthropic.com>
</commit_message>
<xml_diff>
--- a/NYAYAKOSH-Demo-Runbook.docx
+++ b/NYAYAKOSH-Demo-Runbook.docx
@@ -3776,7 +3776,19 @@
           <w:sz w:val="21"/>
           <w:szCs w:val="21"/>
         </w:rPr>
-        <w:t xml:space="preserve">You need to change the stored file without going through the system. Open the folder:</w:t>
+        <w:t xml:space="preserve">Double-click  tamper.bat  in the project folder. That is the whole step.</w:t>
+      </w:r>
+    </w:p>
+    <w:p>
+      <w:pPr>
+        <w:spacing w:after="140" w:line="288"/>
+      </w:pPr>
+      <w:r>
+        <w:rPr>
+          <w:sz w:val="21"/>
+          <w:szCs w:val="21"/>
+        </w:rPr>
+        <w:t xml:space="preserve">It damages the stored file belonging to the most recently uploaded document, then prints which case and document it hit, so there is no doubt about what to click next.</w:t>
       </w:r>
     </w:p>
     <w:p>
@@ -3795,77 +3807,97 @@
           <w:sz w:val="19"/>
           <w:szCs w:val="19"/>
         </w:rPr>
-        <w:t xml:space="preserve">C:\Users\Lenovo\SIH2026\backend\uploads</w:t>
-      </w:r>
-    </w:p>
-    <w:p>
-      <w:pPr>
-        <w:pStyle w:val="ListParagraph"/>
-        <w:numPr>
-          <w:ilvl w:val="0"/>
-          <w:numId w:val="2"/>
-        </w:numPr>
-        <w:spacing w:after="90" w:line="288"/>
+        <w:t xml:space="preserve">tamper.bat</w:t>
+      </w:r>
+    </w:p>
+    <w:p>
+      <w:pPr>
+        <w:spacing w:after="140" w:line="288"/>
       </w:pPr>
       <w:r>
         <w:rPr>
           <w:sz w:val="21"/>
           <w:szCs w:val="21"/>
         </w:rPr>
-        <w:t xml:space="preserve">Sort by Date modified so the newest file is at the top.</w:t>
-      </w:r>
-    </w:p>
-    <w:p>
-      <w:pPr>
-        <w:pStyle w:val="ListParagraph"/>
-        <w:numPr>
-          <w:ilvl w:val="0"/>
-          <w:numId w:val="2"/>
-        </w:numPr>
-        <w:spacing w:after="90" w:line="288"/>
-      </w:pPr>
-      <w:r>
-        <w:rPr>
-          <w:sz w:val="21"/>
-          <w:szCs w:val="21"/>
-        </w:rPr>
-        <w:t xml:space="preserve">Right-click the newest  .enc  file and choose Open with, then Notepad.</w:t>
-      </w:r>
-    </w:p>
-    <w:p>
-      <w:pPr>
-        <w:pStyle w:val="ListParagraph"/>
-        <w:numPr>
-          <w:ilvl w:val="0"/>
-          <w:numId w:val="2"/>
-        </w:numPr>
-        <w:spacing w:after="90" w:line="288"/>
-      </w:pPr>
-      <w:r>
-        <w:rPr>
-          <w:sz w:val="21"/>
-          <w:szCs w:val="21"/>
-        </w:rPr>
-        <w:t xml:space="preserve">Type a single letter anywhere in the jumble of characters.</w:t>
-      </w:r>
-    </w:p>
-    <w:p>
-      <w:pPr>
-        <w:pStyle w:val="ListParagraph"/>
-        <w:numPr>
-          <w:ilvl w:val="0"/>
-          <w:numId w:val="2"/>
-        </w:numPr>
-        <w:spacing w:after="90" w:line="288"/>
-      </w:pPr>
-      <w:r>
-        <w:rPr>
-          <w:sz w:val="21"/>
-          <w:szCs w:val="21"/>
-        </w:rPr>
-        <w:t xml:space="preserve">Save and close. Go back to the browser and click Verify again.</w:t>
-      </w:r>
-    </w:p>
+        <w:t xml:space="preserve">To damage a specific document instead, pass its id - the long code in the browser address bar when that document is open:</w:t>
+      </w:r>
+    </w:p>
+    <w:p>
+      <w:pPr>
+        <w:pBdr>
+          <w:left w:val="single" w:color="C3CAD6" w:sz="18" w:space="8"/>
+        </w:pBdr>
+        <w:shd w:fill="F2F4F8" w:val="clear"/>
+        <w:spacing w:after="100" w:before="60"/>
+        <w:ind w:left="200"/>
+      </w:pPr>
+      <w:r>
+        <w:rPr>
+          <w:rFonts w:ascii="Consolas" w:cs="Consolas" w:eastAsia="Consolas" w:hAnsi="Consolas"/>
+          <w:color w:val="1B2733"/>
+          <w:sz w:val="19"/>
+          <w:szCs w:val="19"/>
+        </w:rPr>
+        <w:t xml:space="preserve">tamper.bat 62df3dd2-a5bf-4611-bc2c-9594842e5b4e</w:t>
+      </w:r>
+    </w:p>
+    <w:tbl>
+      <w:tblPr>
+        <w:tblW w:type="dxa" w:w="9026"/>
+        <w:tblBorders>
+          <w:top w:val="single" w:color="E3A9A2" w:sz="6"/>
+          <w:left w:val="single" w:color="B3261E" w:sz="24"/>
+          <w:bottom w:val="single" w:color="E3A9A2" w:sz="6"/>
+          <w:right w:val="single" w:color="E3A9A2" w:sz="6"/>
+          <w:insideH w:val="none"/>
+          <w:insideV w:val="none"/>
+        </w:tblBorders>
+      </w:tblPr>
+      <w:tblGrid>
+        <w:gridCol w:w="9026"/>
+      </w:tblGrid>
+      <w:tr>
+        <w:tc>
+          <w:tcPr>
+            <w:tcW w:type="dxa" w:w="9026"/>
+            <w:shd w:fill="FDEEEC" w:val="clear"/>
+            <w:tcMar>
+              <w:top w:type="dxa" w:w="140"/>
+              <w:left w:type="dxa" w:w="180"/>
+              <w:bottom w:type="dxa" w:w="140"/>
+              <w:right w:type="dxa" w:w="180"/>
+            </w:tcMar>
+          </w:tcPr>
+          <w:p>
+            <w:pPr>
+              <w:spacing w:after="60"/>
+            </w:pPr>
+            <w:r>
+              <w:rPr>
+                <w:b/>
+                <w:bCs/>
+                <w:color w:val="B3261E"/>
+                <w:sz w:val="21"/>
+                <w:szCs w:val="21"/>
+              </w:rPr>
+              <w:t xml:space="preserve">Do NOT do this by hand</w:t>
+            </w:r>
+          </w:p>
+          <w:p>
+            <w:pPr>
+              <w:spacing w:line="288"/>
+            </w:pPr>
+            <w:r>
+              <w:rPr>
+                <w:sz w:val="21"/>
+                <w:szCs w:val="21"/>
+              </w:rPr>
+              <w:t xml:space="preserve">The obvious manual version - open the newest .enc file in backend\uploads and change a character - is wrong more often than it is right. The newest file belongs to whichever document was uploaded last, which is usually NOT the one you have on screen. You corrupt the wrong document, click Verify, it still says AUTHENTIC, and the demo dies at its most important moment. tamper.bat picks the file by document and tells you what it hit.</w:t>
+            </w:r>
+          </w:p>
+        </w:tc>
+      </w:tr>
+    </w:tbl>
     <w:tbl>
       <w:tblPr>
         <w:tblW w:type="dxa" w:w="9026"/>
@@ -3917,7 +3949,7 @@
                 <w:sz w:val="21"/>
                 <w:szCs w:val="21"/>
               </w:rPr>
-              <w:t xml:space="preserve">It is the moment the whole demo turns on, and fumbling through a folder while people watch is the one part that looks unrehearsed. Know which file you are opening before you start.</w:t>
+              <w:t xml:space="preserve">It is the moment the whole demo turns on. Run tamper.bat once during your dry run so you have seen what it prints.</w:t>
             </w:r>
           </w:p>
         </w:tc>

</xml_diff>